<commit_message>
Regenerate PDFs using signature template with Inter fonts
</commit_message>
<xml_diff>
--- a/applications/WEAK/CGH Technologies - PostgreSQL DBA Developer - 2026-08-21/cover_letter.docx
+++ b/applications/WEAK/CGH Technologies - PostgreSQL DBA Developer - 2026-08-21/cover_letter.docx
@@ -4,39 +4,85 @@
   <w:body>
     <w:p>
       <w:pPr>
-        <w:spacing w:before="0" w:after="40"/>
+        <w:spacing w:after="40" w:before="0"/>
+        <w:jc w:val="left"/>
       </w:pPr>
-      <w:r>
-        <w:rPr>
-          <w:rFonts w:ascii="Calibri" w:hAnsi="Calibri"/>
-          <w:b/>
-          <w:sz w:val="28"/>
-        </w:rPr>
-        <w:t>ALEXANDER TOBIN</w:t>
-      </w:r>
     </w:p>
     <w:p>
       <w:pPr>
-        <w:spacing w:before="0" w:after="280"/>
+        <w:spacing w:after="0" w:before="0"/>
+        <w:jc w:val="left"/>
       </w:pPr>
       <w:r>
         <w:rPr>
           <w:rFonts w:ascii="Calibri" w:hAnsi="Calibri"/>
           <w:b w:val="0"/>
-          <w:color w:val="6B7280"/>
+          <w:color w:val="718096"/>
           <w:sz w:val="20"/>
         </w:rPr>
-        <w:t>(757) 289-1204  |  atobin@alum.utk.edu  |  Virginia Beach, VA</w:t>
+        <w:t>---</w:t>
       </w:r>
     </w:p>
     <w:p>
       <w:pPr>
-        <w:spacing w:before="0" w:after="120"/>
+        <w:spacing w:after="160"/>
+        <w:pBdr>
+          <w:bottom w:val="single" w:sz="16" w:space="1" w:color="1B7A8C"/>
+        </w:pBdr>
+      </w:pPr>
+    </w:p>
+    <w:p>
+      <w:pPr>
+        <w:spacing w:after="0" w:before="0"/>
+        <w:jc w:val="left"/>
       </w:pPr>
       <w:r>
         <w:rPr>
           <w:rFonts w:ascii="Calibri" w:hAnsi="Calibri"/>
           <w:b w:val="0"/>
+          <w:color w:val="09152A"/>
+          <w:sz w:val="21"/>
+        </w:rPr>
+        <w:t>Alexander Tobin</w:t>
+      </w:r>
+    </w:p>
+    <w:p>
+      <w:pPr>
+        <w:spacing w:after="0" w:before="0"/>
+        <w:jc w:val="left"/>
+      </w:pPr>
+      <w:r>
+        <w:rPr>
+          <w:rFonts w:ascii="Calibri" w:hAnsi="Calibri"/>
+          <w:b w:val="0"/>
+          <w:color w:val="09152A"/>
+          <w:sz w:val="21"/>
+        </w:rPr>
+        <w:t>(757) 289-1204 | atobin@alum.utk.edu | Virginia Beach, VA</w:t>
+      </w:r>
+    </w:p>
+    <w:p>
+      <w:pPr>
+        <w:spacing w:after="120" w:before="0"/>
+        <w:jc w:val="left"/>
+      </w:pPr>
+    </w:p>
+    <w:p>
+      <w:pPr>
+        <w:spacing w:after="80" w:before="0"/>
+        <w:jc w:val="left"/>
+      </w:pPr>
+    </w:p>
+    <w:p>
+      <w:pPr>
+        <w:spacing w:after="160" w:before="0"/>
+        <w:jc w:val="left"/>
+      </w:pPr>
+      <w:r>
+        <w:rPr>
+          <w:rFonts w:ascii="Calibri" w:hAnsi="Calibri"/>
+          <w:b w:val="0"/>
+          <w:color w:val="09152A"/>
           <w:sz w:val="22"/>
         </w:rPr>
         <w:t>August 21, 2026</w:t>
@@ -44,12 +90,20 @@
     </w:p>
     <w:p>
       <w:pPr>
-        <w:spacing w:before="0" w:after="40"/>
+        <w:spacing w:after="80" w:before="0"/>
+        <w:jc w:val="left"/>
+      </w:pPr>
+    </w:p>
+    <w:p>
+      <w:pPr>
+        <w:spacing w:after="160" w:before="0"/>
+        <w:jc w:val="left"/>
       </w:pPr>
       <w:r>
         <w:rPr>
           <w:rFonts w:ascii="Calibri" w:hAnsi="Calibri"/>
           <w:b w:val="0"/>
+          <w:color w:val="09152A"/>
           <w:sz w:val="22"/>
         </w:rPr>
         <w:t>Hiring Team</w:t>
@@ -57,12 +111,14 @@
     </w:p>
     <w:p>
       <w:pPr>
-        <w:spacing w:before="0" w:after="280"/>
+        <w:spacing w:after="160" w:before="0"/>
+        <w:jc w:val="left"/>
       </w:pPr>
       <w:r>
         <w:rPr>
           <w:rFonts w:ascii="Calibri" w:hAnsi="Calibri"/>
           <w:b w:val="0"/>
+          <w:color w:val="09152A"/>
           <w:sz w:val="22"/>
         </w:rPr>
         <w:t>CGH Technologies, Inc.</w:t>
@@ -70,12 +126,41 @@
     </w:p>
     <w:p>
       <w:pPr>
-        <w:spacing w:before="0" w:after="200"/>
+        <w:spacing w:after="80" w:before="0"/>
+        <w:jc w:val="left"/>
+      </w:pPr>
+    </w:p>
+    <w:p>
+      <w:pPr>
+        <w:spacing w:after="160" w:before="0"/>
+        <w:jc w:val="left"/>
       </w:pPr>
       <w:r>
         <w:rPr>
           <w:rFonts w:ascii="Calibri" w:hAnsi="Calibri"/>
           <w:b w:val="0"/>
+          <w:color w:val="09152A"/>
+          <w:sz w:val="22"/>
+        </w:rPr>
+        <w:t>---</w:t>
+      </w:r>
+    </w:p>
+    <w:p>
+      <w:pPr>
+        <w:spacing w:after="80" w:before="0"/>
+        <w:jc w:val="left"/>
+      </w:pPr>
+    </w:p>
+    <w:p>
+      <w:pPr>
+        <w:spacing w:after="200" w:before="0"/>
+        <w:jc w:val="left"/>
+      </w:pPr>
+      <w:r>
+        <w:rPr>
+          <w:rFonts w:ascii="Calibri" w:hAnsi="Calibri"/>
+          <w:b/>
+          <w:color w:val="09152A"/>
           <w:sz w:val="22"/>
         </w:rPr>
         <w:t>Dear Hiring Team,</w:t>
@@ -83,12 +168,20 @@
     </w:p>
     <w:p>
       <w:pPr>
-        <w:spacing w:before="0" w:after="200"/>
+        <w:spacing w:after="80" w:before="0"/>
+        <w:jc w:val="left"/>
+      </w:pPr>
+    </w:p>
+    <w:p>
+      <w:pPr>
+        <w:spacing w:after="160" w:before="0"/>
+        <w:jc w:val="left"/>
       </w:pPr>
       <w:r>
         <w:rPr>
           <w:rFonts w:ascii="Calibri" w:hAnsi="Calibri"/>
           <w:b w:val="0"/>
+          <w:color w:val="09152A"/>
           <w:sz w:val="22"/>
         </w:rPr>
         <w:t>I am writing to express my interest in the PostgreSQL DBA/Developer role at CGH Technologies. My background in SQL-driven data analysis, schema design, and pipeline development gives me a meaningful foundation for this work, and I am actively building toward the PostgreSQL-specific depth this role requires.</w:t>
@@ -96,12 +189,20 @@
     </w:p>
     <w:p>
       <w:pPr>
-        <w:spacing w:before="0" w:after="200"/>
+        <w:spacing w:after="80" w:before="0"/>
+        <w:jc w:val="left"/>
+      </w:pPr>
+    </w:p>
+    <w:p>
+      <w:pPr>
+        <w:spacing w:after="160" w:before="0"/>
+        <w:jc w:val="left"/>
       </w:pPr>
       <w:r>
         <w:rPr>
           <w:rFonts w:ascii="Calibri" w:hAnsi="Calibri"/>
           <w:b w:val="0"/>
+          <w:color w:val="09152A"/>
           <w:sz w:val="22"/>
         </w:rPr>
         <w:t>At Ferguson Enterprises, I wrote complex SQL queries against MS SQL Server to validate transaction accuracy across high-volume EDI workflows, analyzing data flows end-to-end to identify mapping failures, schema mismatches, and systemic integration issues. I maintained schema-level documentation, supported UAT and integration testing for data system enhancements, and collaborated closely with application and IT teams on data model requirements. In my freelance work, I have designed normalized relational schemas and multi-stage data pipelines with structured validation and error handling — working from schema definition through to production monitoring.</w:t>
@@ -109,12 +210,20 @@
     </w:p>
     <w:p>
       <w:pPr>
-        <w:spacing w:before="0" w:after="200"/>
+        <w:spacing w:after="80" w:before="0"/>
+        <w:jc w:val="left"/>
+      </w:pPr>
+    </w:p>
+    <w:p>
+      <w:pPr>
+        <w:spacing w:after="160" w:before="0"/>
+        <w:jc w:val="left"/>
       </w:pPr>
       <w:r>
         <w:rPr>
           <w:rFonts w:ascii="Calibri" w:hAnsi="Calibri"/>
           <w:b w:val="0"/>
+          <w:color w:val="09152A"/>
           <w:sz w:val="22"/>
         </w:rPr>
         <w:t>I will be direct about the gap: my SQL experience is on MS SQL Server rather than PostgreSQL, and I do not yet have hands-on experience with PostGIS or spatial data workflows. The core concepts — indexing strategy, query performance analysis, stored procedures, schema design, replication concepts — are areas where my SQL foundation applies, and I am currently pursuing the DP-203 Azure Data Engineering certification as part of a deliberate move toward deeper database engineering. I am a fast learner in new environments and would bring genuine commitment to closing the PostgreSQL and PostGIS gap.</w:t>
@@ -122,12 +231,20 @@
     </w:p>
     <w:p>
       <w:pPr>
-        <w:spacing w:before="0" w:after="200"/>
+        <w:spacing w:after="80" w:before="0"/>
+        <w:jc w:val="left"/>
+      </w:pPr>
+    </w:p>
+    <w:p>
+      <w:pPr>
+        <w:spacing w:after="160" w:before="0"/>
+        <w:jc w:val="left"/>
       </w:pPr>
       <w:r>
         <w:rPr>
           <w:rFonts w:ascii="Calibri" w:hAnsi="Calibri"/>
           <w:b w:val="0"/>
+          <w:color w:val="09152A"/>
           <w:sz w:val="22"/>
         </w:rPr>
         <w:t>I would welcome the chance to discuss how my experience and trajectory fit CGH's needs on this engagement.</w:t>
@@ -135,12 +252,20 @@
     </w:p>
     <w:p>
       <w:pPr>
-        <w:spacing w:before="0" w:after="400"/>
+        <w:spacing w:after="80" w:before="0"/>
+        <w:jc w:val="left"/>
+      </w:pPr>
+    </w:p>
+    <w:p>
+      <w:pPr>
+        <w:spacing w:after="160" w:before="0"/>
+        <w:jc w:val="left"/>
       </w:pPr>
       <w:r>
         <w:rPr>
           <w:rFonts w:ascii="Calibri" w:hAnsi="Calibri"/>
           <w:b w:val="0"/>
+          <w:color w:val="09152A"/>
           <w:sz w:val="22"/>
         </w:rPr>
         <w:t>Thank you for your consideration.</w:t>
@@ -148,12 +273,26 @@
     </w:p>
     <w:p>
       <w:pPr>
-        <w:spacing w:before="0" w:after="80"/>
+        <w:spacing w:after="80" w:before="0"/>
+        <w:jc w:val="left"/>
+      </w:pPr>
+    </w:p>
+    <w:p>
+      <w:pPr>
+        <w:spacing w:after="120" w:before="0"/>
+        <w:jc w:val="left"/>
+      </w:pPr>
+    </w:p>
+    <w:p>
+      <w:pPr>
+        <w:spacing w:after="0" w:before="0"/>
+        <w:jc w:val="left"/>
       </w:pPr>
       <w:r>
         <w:rPr>
           <w:rFonts w:ascii="Calibri" w:hAnsi="Calibri"/>
           <w:b w:val="0"/>
+          <w:color w:val="09152A"/>
           <w:sz w:val="22"/>
         </w:rPr>
         <w:t>Sincerely,</w:t>
@@ -161,12 +300,14 @@
     </w:p>
     <w:p>
       <w:pPr>
-        <w:spacing w:before="0" w:after="120"/>
+        <w:spacing w:after="160" w:before="0"/>
+        <w:jc w:val="left"/>
       </w:pPr>
       <w:r>
         <w:rPr>
           <w:rFonts w:ascii="Calibri" w:hAnsi="Calibri"/>
-          <w:b/>
+          <w:b w:val="0"/>
+          <w:color w:val="09152A"/>
           <w:sz w:val="22"/>
         </w:rPr>
         <w:t>Alexander Tobin</w:t>
@@ -174,7 +315,7 @@
     </w:p>
     <w:sectPr>
       <w:pgSz w:w="12240" w:h="15840"/>
-      <w:pgMar w:top="1440" w:right="1584" w:bottom="1440" w:left="1584" w:header="720" w:footer="720" w:gutter="0"/>
+      <w:pgMar w:top="1152" w:right="1584" w:bottom="1152" w:left="1584" w:header="720" w:footer="720" w:gutter="0"/>
       <w:cols w:space="720"/>
       <w:docGrid w:linePitch="360"/>
     </w:sectPr>
@@ -545,6 +686,10 @@
     <w:name w:val="Normal"/>
     <w:qFormat/>
     <w:rsid w:val="00FC693F"/>
+    <w:rPr>
+      <w:rFonts w:ascii="Calibri" w:hAnsi="Calibri"/>
+      <w:sz w:val="22"/>
+    </w:rPr>
   </w:style>
   <w:style w:type="paragraph" w:styleId="Header">
     <w:name w:val="header"/>

</xml_diff>